<commit_message>
Them HĐ5 Cung co (mindmap+QR) vao 34 KHBD SU12+DIA12; them HD chua bai GV vao index.html
Co-Authored-By: Claude Sonnet 4.6 <noreply@anthropic.com>
</commit_message>
<xml_diff>
--- a/mon/dia_li/khbd/lop12/KHBD_DIALY12_Bai10_TH_BaoCaoDanCu_T20.docx
+++ b/mon/dia_li/khbd/lop12/KHBD_DIALY12_Bai10_TH_BaoCaoDanCu_T20.docx
@@ -1275,6 +1275,361 @@
         </w:tc>
       </w:tr>
     </w:tbl>
+    <w:p>
+      <w:r>
+        <w:br w:type="page"/>
+      </w:r>
+    </w:p>
+    <w:p>
+      <w:pPr>
+        <w:pStyle w:val="Heading2"/>
+        <w:spacing w:before="120" w:after="120"/>
+      </w:pPr>
+      <w:r>
+        <w:rPr>
+          <w:color w:val="1E40AF"/>
+          <w:sz w:val="28"/>
+        </w:rPr>
+        <w:t>5. CỦNG CỐ VÀ DẶN DÒ</w:t>
+      </w:r>
+    </w:p>
+    <w:p>
+      <w:pPr>
+        <w:spacing w:before="80" w:after="80"/>
+      </w:pPr>
+      <w:r>
+        <w:rPr>
+          <w:b/>
+          <w:color w:val="1E40AF"/>
+          <w:sz w:val="26"/>
+        </w:rPr>
+        <w:t>A. SƠ ĐỒ TƯ DUY</w:t>
+      </w:r>
+    </w:p>
+    <w:tbl>
+      <w:tblPr>
+        <w:tblStyle w:val="TableGrid"/>
+        <w:tblW w:type="auto" w:w="0"/>
+        <w:tblLayout w:type="fixed"/>
+        <w:tblLook w:firstColumn="1" w:firstRow="1" w:lastColumn="0" w:lastRow="0" w:noHBand="0" w:noVBand="1" w:val="04A0"/>
+      </w:tblPr>
+      <w:tblGrid>
+        <w:gridCol w:w="4844"/>
+        <w:gridCol w:w="4844"/>
+      </w:tblGrid>
+      <w:tr>
+        <w:tc>
+          <w:tcPr>
+            <w:tcW w:type="dxa" w:w="9355"/>
+            <w:gridSpan w:val="2"/>
+            <w:shd w:val="clear" w:color="auto" w:fill="1E40AF"/>
+          </w:tcPr>
+          <w:p>
+            <w:pPr>
+              <w:spacing w:before="40" w:after="40"/>
+              <w:jc w:val="center"/>
+            </w:pPr>
+            <w:r>
+              <w:rPr>
+                <w:b/>
+                <w:color w:val="FFFFFF"/>
+                <w:sz w:val="24"/>
+              </w:rPr>
+              <w:t>Bài 10 (TH). Báo cáo dân cư</w:t>
+            </w:r>
+          </w:p>
+        </w:tc>
+      </w:tr>
+      <w:tr>
+        <w:tc>
+          <w:tcPr>
+            <w:tcW w:type="dxa" w:w="2835"/>
+            <w:shd w:val="clear" w:color="auto" w:fill="7C3AED"/>
+          </w:tcPr>
+          <w:p>
+            <w:pPr>
+              <w:spacing w:before="40" w:after="40"/>
+              <w:jc w:val="center"/>
+            </w:pPr>
+            <w:r>
+              <w:rPr>
+                <w:b/>
+                <w:color w:val="FFFFFF"/>
+                <w:sz w:val="22"/>
+              </w:rPr>
+              <w:t>Tháp dân số</w:t>
+            </w:r>
+          </w:p>
+        </w:tc>
+        <w:tc>
+          <w:tcPr>
+            <w:tcW w:type="dxa" w:w="6520"/>
+            <w:shd w:val="clear" w:color="auto" w:fill="EDE9FE"/>
+          </w:tcPr>
+          <w:p>
+            <w:pPr>
+              <w:spacing w:before="40" w:after="40"/>
+              <w:jc w:val="left"/>
+            </w:pPr>
+            <w:r>
+              <w:rPr>
+                <w:color w:val="4C1D95"/>
+                <w:sz w:val="22"/>
+              </w:rPr>
+              <w:t>Trục hoành: % nam-nữ  •  Trục tung: nhóm tuổi  •  Đọc hình dạng tháp</w:t>
+            </w:r>
+          </w:p>
+        </w:tc>
+      </w:tr>
+      <w:tr>
+        <w:tc>
+          <w:tcPr>
+            <w:tcW w:type="dxa" w:w="2835"/>
+            <w:shd w:val="clear" w:color="auto" w:fill="065F46"/>
+          </w:tcPr>
+          <w:p>
+            <w:pPr>
+              <w:spacing w:before="40" w:after="40"/>
+              <w:jc w:val="center"/>
+            </w:pPr>
+            <w:r>
+              <w:rPr>
+                <w:b/>
+                <w:color w:val="FFFFFF"/>
+                <w:sz w:val="22"/>
+              </w:rPr>
+              <w:t>Phân tích tháp VN 2023</w:t>
+            </w:r>
+          </w:p>
+        </w:tc>
+        <w:tc>
+          <w:tcPr>
+            <w:tcW w:type="dxa" w:w="6520"/>
+            <w:shd w:val="clear" w:color="auto" w:fill="D1FAE5"/>
+          </w:tcPr>
+          <w:p>
+            <w:pPr>
+              <w:spacing w:before="40" w:after="40"/>
+              <w:jc w:val="left"/>
+            </w:pPr>
+            <w:r>
+              <w:rPr>
+                <w:color w:val="022C22"/>
+                <w:sz w:val="22"/>
+              </w:rPr>
+              <w:t>Đang già hóa  •  Tỉ lệ 60+ tăng nhanh  •  Lực lượng LĐ vẫn lớn</w:t>
+            </w:r>
+          </w:p>
+        </w:tc>
+      </w:tr>
+      <w:tr>
+        <w:tc>
+          <w:tcPr>
+            <w:tcW w:type="dxa" w:w="2835"/>
+            <w:shd w:val="clear" w:color="auto" w:fill="B91C1C"/>
+          </w:tcPr>
+          <w:p>
+            <w:pPr>
+              <w:spacing w:before="40" w:after="40"/>
+              <w:jc w:val="center"/>
+            </w:pPr>
+            <w:r>
+              <w:rPr>
+                <w:b/>
+                <w:color w:val="FFFFFF"/>
+                <w:sz w:val="22"/>
+              </w:rPr>
+              <w:t>Biểu đồ dân số địa phương</w:t>
+            </w:r>
+          </w:p>
+        </w:tc>
+        <w:tc>
+          <w:tcPr>
+            <w:tcW w:type="dxa" w:w="6520"/>
+            <w:shd w:val="clear" w:color="auto" w:fill="FEE2E2"/>
+          </w:tcPr>
+          <w:p>
+            <w:pPr>
+              <w:spacing w:before="40" w:after="40"/>
+              <w:jc w:val="left"/>
+            </w:pPr>
+            <w:r>
+              <w:rPr>
+                <w:color w:val="450A0A"/>
+                <w:sz w:val="22"/>
+              </w:rPr>
+              <w:t>Dân số theo năm  •  Cơ cấu ĐT/NT  •  So với cả nước</w:t>
+            </w:r>
+          </w:p>
+        </w:tc>
+      </w:tr>
+      <w:tr>
+        <w:tc>
+          <w:tcPr>
+            <w:tcW w:type="dxa" w:w="2835"/>
+            <w:shd w:val="clear" w:color="auto" w:fill="B45309"/>
+          </w:tcPr>
+          <w:p>
+            <w:pPr>
+              <w:spacing w:before="40" w:after="40"/>
+              <w:jc w:val="center"/>
+            </w:pPr>
+            <w:r>
+              <w:rPr>
+                <w:b/>
+                <w:color w:val="FFFFFF"/>
+                <w:sz w:val="22"/>
+              </w:rPr>
+              <w:t>Liên hệ Bình Định</w:t>
+            </w:r>
+          </w:p>
+        </w:tc>
+        <w:tc>
+          <w:tcPr>
+            <w:tcW w:type="dxa" w:w="6520"/>
+            <w:shd w:val="clear" w:color="auto" w:fill="FEF3C7"/>
+          </w:tcPr>
+          <w:p>
+            <w:pPr>
+              <w:spacing w:before="40" w:after="40"/>
+              <w:jc w:val="left"/>
+            </w:pPr>
+            <w:r>
+              <w:rPr>
+                <w:color w:val="451A03"/>
+                <w:sz w:val="22"/>
+              </w:rPr>
+              <w:t>1,3 triệu dân  •  ĐT hóa ~50%  •  Vĩnh Thạnh 25 000 người</w:t>
+            </w:r>
+          </w:p>
+        </w:tc>
+      </w:tr>
+    </w:tbl>
+    <w:p/>
+    <w:p>
+      <w:r>
+        <w:rPr>
+          <w:b/>
+          <w:color w:val="1E40AF"/>
+          <w:sz w:val="26"/>
+        </w:rPr>
+        <w:t>B. BÀI TẬP CỦNG CỐ TRỰC TUYẾN</w:t>
+      </w:r>
+    </w:p>
+    <w:p>
+      <w:pPr>
+        <w:spacing w:before="40" w:after="40"/>
+      </w:pPr>
+      <w:r>
+        <w:rPr>
+          <w:b/>
+          <w:sz w:val="22"/>
+        </w:rPr>
+        <w:t xml:space="preserve">🔗 Link bài củng cố: </w:t>
+      </w:r>
+      <w:r>
+        <w:rPr>
+          <w:color w:val="1E40AF"/>
+          <w:sz w:val="22"/>
+        </w:rPr>
+        <w:t>https://trangtu66.github.io/Taode_thi_online/dia_cc_bai10_k12.html</w:t>
+      </w:r>
+    </w:p>
+    <w:p>
+      <w:pPr>
+        <w:spacing w:before="80"/>
+        <w:jc w:val="center"/>
+      </w:pPr>
+      <w:r>
+        <w:drawing>
+          <wp:inline xmlns:a="http://schemas.openxmlformats.org/drawingml/2006/main" xmlns:pic="http://schemas.openxmlformats.org/drawingml/2006/picture">
+            <wp:extent cx="1645920" cy="1645920"/>
+            <wp:docPr id="1" name="Picture 1"/>
+            <wp:cNvGraphicFramePr>
+              <a:graphicFrameLocks noChangeAspect="1"/>
+            </wp:cNvGraphicFramePr>
+            <a:graphic>
+              <a:graphicData uri="http://schemas.openxmlformats.org/drawingml/2006/picture">
+                <pic:pic>
+                  <pic:nvPicPr>
+                    <pic:cNvPr id="0" name="QR_CungCo_DIA12_Bai10.png"/>
+                    <pic:cNvPicPr/>
+                  </pic:nvPicPr>
+                  <pic:blipFill>
+                    <a:blip r:embed="rId9"/>
+                    <a:stretch>
+                      <a:fillRect/>
+                    </a:stretch>
+                  </pic:blipFill>
+                  <pic:spPr>
+                    <a:xfrm>
+                      <a:off x="0" y="0"/>
+                      <a:ext cx="1645920" cy="1645920"/>
+                    </a:xfrm>
+                    <a:prstGeom prst="rect"/>
+                  </pic:spPr>
+                </pic:pic>
+              </a:graphicData>
+            </a:graphic>
+          </wp:inline>
+        </w:drawing>
+      </w:r>
+    </w:p>
+    <w:p>
+      <w:r>
+        <w:rPr>
+          <w:i/>
+          <w:sz w:val="22"/>
+        </w:rPr>
+        <w:t>📱 Quét mã QR hoặc truy cập đường link để làm bài tập củng cố trực tuyến (6 câu trắc nghiệm + 1 câu đúng/sai). Kết quả được ghi nhận tự động.</w:t>
+      </w:r>
+    </w:p>
+    <w:p>
+      <w:r>
+        <w:rPr>
+          <w:b/>
+          <w:color w:val="1E40AF"/>
+          <w:sz w:val="26"/>
+        </w:rPr>
+        <w:t>C. DẶN DÒ</w:t>
+      </w:r>
+    </w:p>
+    <w:p>
+      <w:pPr>
+        <w:pStyle w:val="ListBullet"/>
+        <w:spacing w:before="20" w:after="20"/>
+      </w:pPr>
+      <w:r>
+        <w:rPr>
+          <w:sz w:val="22"/>
+        </w:rPr>
+        <w:t>Hoàn thành bài tập củng cố trực tuyến trước tiết học sau.</w:t>
+      </w:r>
+    </w:p>
+    <w:p>
+      <w:pPr>
+        <w:pStyle w:val="ListBullet"/>
+        <w:spacing w:before="20" w:after="20"/>
+      </w:pPr>
+      <w:r>
+        <w:rPr>
+          <w:sz w:val="22"/>
+        </w:rPr>
+        <w:t>Xem trước Bài 11. Chuyển dịch cơ cấu kinh tế theo phân phối chương trình.</w:t>
+      </w:r>
+    </w:p>
+    <w:p>
+      <w:pPr>
+        <w:pStyle w:val="ListBullet"/>
+        <w:spacing w:before="20" w:after="20"/>
+      </w:pPr>
+      <w:r>
+        <w:rPr>
+          <w:sz w:val="22"/>
+        </w:rPr>
+        <w:t>Ôn lại sơ đồ tư duy bài vừa học.</w:t>
+      </w:r>
+    </w:p>
     <w:sectPr>
       <w:pgSz w:w="12240" w:h="15840"/>
       <w:pgMar w:top="1134" w:right="1134" w:bottom="1134" w:left="1417" w:header="720" w:footer="720" w:gutter="0"/>

</xml_diff>

<commit_message>
Nang cap so do tu duy Premium va an danh hanh chinh cho toan bo KHBD/slide cu
- So do bong bong chuan moi (goc Navy #002060 chu in hoa trang; cap 1 #E2EFDA/#FFF2CC
  vien dam chu den dam; cap 2 pastel; khung tu co gian om chu, xuong dong 3-4 tu)
  cho Toan 10-11-12, Vat li 12, Lich su 12, Dia li 12, Hoa hoc 10, Ngu van 10-12, Sinh hoc 10-12
- Word: thay anh/bang so do cu; bai chua co so do duoc them so do + QR o cuoi file
- Slide: ve lai so do bang hinh khoi PowerPoint; bo Su 12 ban cu duoc chen slide so do o vi tri 4
- README: Mermaid co init htmlLabels/padding 10, bang mau Premium
- An danh: "Truong THPT", tac gia TTT, de trong ngay soan/ho ten GV, xoa khoi chu ky
- Noi dung cac hoat dong day hoc giu nguyen

Co-Authored-By: Claude Opus 5.5 <noreply@anthropic.com>
</commit_message>
<xml_diff>
--- a/mon/dia_li/khbd/lop12/KHBD_DIALY12_Bai10_TH_BaoCaoDanCu_T20.docx
+++ b/mon/dia_li/khbd/lop12/KHBD_DIALY12_Bai10_TH_BaoCaoDanCu_T20.docx
@@ -12,14 +12,13 @@
           <w:i/>
           <w:sz w:val="24"/>
         </w:rPr>
-        <w:t>Ngày 26 tháng 11 năm 2026</w:t>
+        <w:t>Ngày …… tháng …… năm ……    Họ và tên giáo viên: ……………………………</w:t>
       </w:r>
       <w:r>
         <w:rPr>
           <w:rFonts w:ascii="Times New Roman" w:hAnsi="Times New Roman"/>
           <w:sz w:val="24"/>
         </w:rPr>
-        <w:t xml:space="preserve">    Họ và tên giáo viên: Lê Thuỳ Dung</w:t>
       </w:r>
     </w:p>
     <w:p>
@@ -1138,143 +1137,6 @@
       </w:r>
     </w:p>
     <w:p/>
-    <w:tbl>
-      <w:tblPr>
-        <w:tblStyle w:val="TableGrid"/>
-        <w:tblW w:type="auto" w:w="0"/>
-        <w:tblLook w:firstColumn="1" w:firstRow="1" w:lastColumn="0" w:lastRow="0" w:noHBand="0" w:noVBand="1" w:val="04A0"/>
-      </w:tblPr>
-      <w:tblGrid>
-        <w:gridCol w:w="3230"/>
-        <w:gridCol w:w="3230"/>
-        <w:gridCol w:w="3230"/>
-      </w:tblGrid>
-      <w:tr>
-        <w:tc>
-          <w:tcPr>
-            <w:tcW w:type="dxa" w:w="3230"/>
-          </w:tcPr>
-          <w:p>
-            <w:pPr>
-              <w:jc w:val="center"/>
-            </w:pPr>
-            <w:r>
-              <w:rPr>
-                <w:rFonts w:ascii="Times New Roman" w:hAnsi="Times New Roman"/>
-                <w:b/>
-                <w:sz w:val="24"/>
-              </w:rPr>
-              <w:t>TỔ TRƯỞNG CHUYÊN MÔN</w:t>
-            </w:r>
-          </w:p>
-        </w:tc>
-        <w:tc>
-          <w:tcPr>
-            <w:tcW w:type="dxa" w:w="3230"/>
-          </w:tcPr>
-          <w:p>
-            <w:pPr>
-              <w:jc w:val="center"/>
-            </w:pPr>
-            <w:r>
-              <w:rPr>
-                <w:rFonts w:ascii="Times New Roman" w:hAnsi="Times New Roman"/>
-                <w:b/>
-                <w:sz w:val="24"/>
-              </w:rPr>
-              <w:t>Vĩnh Thạnh, ngày 28 tháng 11 năm 2026</w:t>
-            </w:r>
-          </w:p>
-        </w:tc>
-        <w:tc>
-          <w:tcPr>
-            <w:tcW w:type="dxa" w:w="3230"/>
-          </w:tcPr>
-          <w:p>
-            <w:pPr>
-              <w:jc w:val="center"/>
-            </w:pPr>
-            <w:r>
-              <w:rPr>
-                <w:rFonts w:ascii="Times New Roman" w:hAnsi="Times New Roman"/>
-                <w:b/>
-                <w:sz w:val="24"/>
-              </w:rPr>
-              <w:t>KIỂM TRA CỦA LÃNH ĐẠO</w:t>
-              <w:br/>
-              <w:t>PHÓ HIỆU TRƯỞNG</w:t>
-            </w:r>
-          </w:p>
-        </w:tc>
-      </w:tr>
-      <w:tr>
-        <w:tc>
-          <w:tcPr>
-            <w:tcW w:type="dxa" w:w="3230"/>
-          </w:tcPr>
-          <w:p>
-            <w:pPr>
-              <w:jc w:val="center"/>
-            </w:pPr>
-            <w:r>
-              <w:rPr>
-                <w:rFonts w:ascii="Times New Roman" w:hAnsi="Times New Roman"/>
-                <w:sz w:val="24"/>
-              </w:rPr>
-              <w:br/>
-              <w:br/>
-              <w:br/>
-              <w:t>Trương Văn Hiếu</w:t>
-            </w:r>
-          </w:p>
-        </w:tc>
-        <w:tc>
-          <w:tcPr>
-            <w:tcW w:type="dxa" w:w="3230"/>
-          </w:tcPr>
-          <w:p>
-            <w:pPr>
-              <w:jc w:val="center"/>
-            </w:pPr>
-            <w:r>
-              <w:rPr>
-                <w:rFonts w:ascii="Times New Roman" w:hAnsi="Times New Roman"/>
-                <w:sz w:val="24"/>
-              </w:rPr>
-              <w:br/>
-              <w:br/>
-              <w:br/>
-              <w:t>NGƯỜI SOẠN</w:t>
-              <w:br/>
-              <w:br/>
-              <w:br/>
-              <w:br/>
-              <w:t>Lê Thuỳ Dung</w:t>
-            </w:r>
-          </w:p>
-        </w:tc>
-        <w:tc>
-          <w:tcPr>
-            <w:tcW w:type="dxa" w:w="3230"/>
-          </w:tcPr>
-          <w:p>
-            <w:pPr>
-              <w:jc w:val="center"/>
-            </w:pPr>
-            <w:r>
-              <w:rPr>
-                <w:rFonts w:ascii="Times New Roman" w:hAnsi="Times New Roman"/>
-                <w:sz w:val="24"/>
-              </w:rPr>
-              <w:br/>
-              <w:br/>
-              <w:br/>
-              <w:t>Bùi Xuân Thanh</w:t>
-            </w:r>
-          </w:p>
-        </w:tc>
-      </w:tr>
-    </w:tbl>
     <w:p>
       <w:r>
         <w:br w:type="page"/>
@@ -1306,205 +1168,57 @@
         <w:t>A. SƠ ĐỒ TƯ DUY</w:t>
       </w:r>
     </w:p>
-    <w:tbl>
-      <w:tblPr>
-        <w:tblStyle w:val="TableGrid"/>
-        <w:tblW w:type="auto" w:w="0"/>
-        <w:tblLayout w:type="fixed"/>
-        <w:tblLook w:firstColumn="1" w:firstRow="1" w:lastColumn="0" w:lastRow="0" w:noHBand="0" w:noVBand="1" w:val="04A0"/>
-      </w:tblPr>
-      <w:tblGrid>
-        <w:gridCol w:w="4844"/>
-        <w:gridCol w:w="4844"/>
-      </w:tblGrid>
-      <w:tr>
-        <w:tc>
-          <w:tcPr>
-            <w:tcW w:type="dxa" w:w="9355"/>
-            <w:gridSpan w:val="2"/>
-            <w:shd w:val="clear" w:color="auto" w:fill="1E40AF"/>
-          </w:tcPr>
-          <w:p>
-            <w:pPr>
-              <w:spacing w:before="40" w:after="40"/>
-              <w:jc w:val="center"/>
-            </w:pPr>
-            <w:r>
-              <w:rPr>
-                <w:b/>
-                <w:color w:val="FFFFFF"/>
-                <w:sz w:val="24"/>
-              </w:rPr>
-              <w:t>Bài 10 (TH). Báo cáo dân cư</w:t>
-            </w:r>
-          </w:p>
-        </w:tc>
-      </w:tr>
-      <w:tr>
-        <w:tc>
-          <w:tcPr>
-            <w:tcW w:type="dxa" w:w="2835"/>
-            <w:shd w:val="clear" w:color="auto" w:fill="7C3AED"/>
-          </w:tcPr>
-          <w:p>
-            <w:pPr>
-              <w:spacing w:before="40" w:after="40"/>
-              <w:jc w:val="center"/>
-            </w:pPr>
-            <w:r>
-              <w:rPr>
-                <w:b/>
-                <w:color w:val="FFFFFF"/>
-                <w:sz w:val="22"/>
-              </w:rPr>
-              <w:t>Tháp dân số</w:t>
-            </w:r>
-          </w:p>
-        </w:tc>
-        <w:tc>
-          <w:tcPr>
-            <w:tcW w:type="dxa" w:w="6520"/>
-            <w:shd w:val="clear" w:color="auto" w:fill="EDE9FE"/>
-          </w:tcPr>
-          <w:p>
-            <w:pPr>
-              <w:spacing w:before="40" w:after="40"/>
-              <w:jc w:val="left"/>
-            </w:pPr>
-            <w:r>
-              <w:rPr>
-                <w:color w:val="4C1D95"/>
-                <w:sz w:val="22"/>
-              </w:rPr>
-              <w:t>Trục hoành: % nam-nữ  •  Trục tung: nhóm tuổi  •  Đọc hình dạng tháp</w:t>
-            </w:r>
-          </w:p>
-        </w:tc>
-      </w:tr>
-      <w:tr>
-        <w:tc>
-          <w:tcPr>
-            <w:tcW w:type="dxa" w:w="2835"/>
-            <w:shd w:val="clear" w:color="auto" w:fill="065F46"/>
-          </w:tcPr>
-          <w:p>
-            <w:pPr>
-              <w:spacing w:before="40" w:after="40"/>
-              <w:jc w:val="center"/>
-            </w:pPr>
-            <w:r>
-              <w:rPr>
-                <w:b/>
-                <w:color w:val="FFFFFF"/>
-                <w:sz w:val="22"/>
-              </w:rPr>
-              <w:t>Phân tích tháp VN 2023</w:t>
-            </w:r>
-          </w:p>
-        </w:tc>
-        <w:tc>
-          <w:tcPr>
-            <w:tcW w:type="dxa" w:w="6520"/>
-            <w:shd w:val="clear" w:color="auto" w:fill="D1FAE5"/>
-          </w:tcPr>
-          <w:p>
-            <w:pPr>
-              <w:spacing w:before="40" w:after="40"/>
-              <w:jc w:val="left"/>
-            </w:pPr>
-            <w:r>
-              <w:rPr>
-                <w:color w:val="022C22"/>
-                <w:sz w:val="22"/>
-              </w:rPr>
-              <w:t>Đang già hóa  •  Tỉ lệ 60+ tăng nhanh  •  Lực lượng LĐ vẫn lớn</w:t>
-            </w:r>
-          </w:p>
-        </w:tc>
-      </w:tr>
-      <w:tr>
-        <w:tc>
-          <w:tcPr>
-            <w:tcW w:type="dxa" w:w="2835"/>
-            <w:shd w:val="clear" w:color="auto" w:fill="B91C1C"/>
-          </w:tcPr>
-          <w:p>
-            <w:pPr>
-              <w:spacing w:before="40" w:after="40"/>
-              <w:jc w:val="center"/>
-            </w:pPr>
-            <w:r>
-              <w:rPr>
-                <w:b/>
-                <w:color w:val="FFFFFF"/>
-                <w:sz w:val="22"/>
-              </w:rPr>
-              <w:t>Biểu đồ dân số địa phương</w:t>
-            </w:r>
-          </w:p>
-        </w:tc>
-        <w:tc>
-          <w:tcPr>
-            <w:tcW w:type="dxa" w:w="6520"/>
-            <w:shd w:val="clear" w:color="auto" w:fill="FEE2E2"/>
-          </w:tcPr>
-          <w:p>
-            <w:pPr>
-              <w:spacing w:before="40" w:after="40"/>
-              <w:jc w:val="left"/>
-            </w:pPr>
-            <w:r>
-              <w:rPr>
-                <w:color w:val="450A0A"/>
-                <w:sz w:val="22"/>
-              </w:rPr>
-              <w:t>Dân số theo năm  •  Cơ cấu ĐT/NT  •  So với cả nước</w:t>
-            </w:r>
-          </w:p>
-        </w:tc>
-      </w:tr>
-      <w:tr>
-        <w:tc>
-          <w:tcPr>
-            <w:tcW w:type="dxa" w:w="2835"/>
-            <w:shd w:val="clear" w:color="auto" w:fill="B45309"/>
-          </w:tcPr>
-          <w:p>
-            <w:pPr>
-              <w:spacing w:before="40" w:after="40"/>
-              <w:jc w:val="center"/>
-            </w:pPr>
-            <w:r>
-              <w:rPr>
-                <w:b/>
-                <w:color w:val="FFFFFF"/>
-                <w:sz w:val="22"/>
-              </w:rPr>
-              <w:t>Liên hệ Bình Định</w:t>
-            </w:r>
-          </w:p>
-        </w:tc>
-        <w:tc>
-          <w:tcPr>
-            <w:tcW w:type="dxa" w:w="6520"/>
-            <w:shd w:val="clear" w:color="auto" w:fill="FEF3C7"/>
-          </w:tcPr>
-          <w:p>
-            <w:pPr>
-              <w:spacing w:before="40" w:after="40"/>
-              <w:jc w:val="left"/>
-            </w:pPr>
-            <w:r>
-              <w:rPr>
-                <w:color w:val="451A03"/>
-                <w:sz w:val="22"/>
-              </w:rPr>
-              <w:t>1,3 triệu dân  •  ĐT hóa ~50%  •  Vĩnh Thạnh 25 000 người</w:t>
-            </w:r>
-          </w:p>
-        </w:tc>
-      </w:tr>
-    </w:tbl>
+    <w:p>
+      <w:pPr>
+        <w:jc w:val="center"/>
+      </w:pPr>
+      <w:r>
+        <w:drawing>
+          <wp:inline xmlns:a="http://schemas.openxmlformats.org/drawingml/2006/main" xmlns:pic="http://schemas.openxmlformats.org/drawingml/2006/picture">
+            <wp:extent cx="5940000" cy="3335425"/>
+            <wp:docPr id="7" name="Picture 7"/>
+            <wp:cNvGraphicFramePr>
+              <a:graphicFrameLocks noChangeAspect="1"/>
+            </wp:cNvGraphicFramePr>
+            <a:graphic>
+              <a:graphicData uri="http://schemas.openxmlformats.org/drawingml/2006/picture">
+                <pic:pic>
+                  <pic:nvPicPr>
+                    <pic:cNvPr id="0" name="image.png"/>
+                    <pic:cNvPicPr/>
+                  </pic:nvPicPr>
+                  <pic:blipFill>
+                    <a:blip r:embed="rId15"/>
+                    <a:stretch>
+                      <a:fillRect/>
+                    </a:stretch>
+                  </pic:blipFill>
+                  <pic:spPr>
+                    <a:xfrm>
+                      <a:off x="0" y="0"/>
+                      <a:ext cx="5940000" cy="3335425"/>
+                    </a:xfrm>
+                    <a:prstGeom prst="rect"/>
+                  </pic:spPr>
+                </pic:pic>
+              </a:graphicData>
+            </a:graphic>
+          </wp:inline>
+        </w:drawing>
+      </w:r>
+    </w:p>
+    <w:p>
+      <w:pPr>
+        <w:jc w:val="center"/>
+      </w:pPr>
+      <w:r>
+        <w:rPr>
+          <w:i/>
+          <w:sz w:val="20"/>
+        </w:rPr>
+        <w:t>Sơ đồ tư duy – Bài 10 (TH). Báo cáo dân cư (TTT biên soạn theo SGK)</w:t>
+      </w:r>
+    </w:p>
     <w:p/>
     <w:p>
       <w:r>
@@ -1631,6 +1345,10 @@
       </w:r>
     </w:p>
     <w:sectPr>
+      <w:headerReference w:type="default" r:id="rId10"/>
+      <w:footerReference w:type="default" r:id="rId11"/>
+      <w:headerReference w:type="first" r:id="rId12"/>
+      <w:footerReference w:type="first" r:id="rId13"/>
       <w:pgSz w:w="12240" w:h="15840"/>
       <w:pgMar w:top="1134" w:right="1134" w:bottom="1134" w:left="1417" w:header="720" w:footer="720" w:gutter="0"/>
       <w:cols w:space="720"/>
@@ -1638,6 +1356,46 @@
     </w:sectPr>
   </w:body>
 </w:document>
+</file>
+
+<file path=word/footer1.xml><?xml version="1.0" encoding="utf-8"?>
+<w:ftr xmlns:m="http://schemas.openxmlformats.org/officeDocument/2006/math" xmlns:mc="http://schemas.openxmlformats.org/markup-compatibility/2006" xmlns:mo="http://schemas.microsoft.com/office/mac/office/2008/main" xmlns:mv="urn:schemas-microsoft-com:mac:vml" xmlns:o="urn:schemas-microsoft-com:office:office" xmlns:r="http://schemas.openxmlformats.org/officeDocument/2006/relationships" xmlns:v="urn:schemas-microsoft-com:vml" xmlns:w10="urn:schemas-microsoft-com:office:word" xmlns:w14="http://schemas.microsoft.com/office/word/2010/wordml" xmlns:w="http://schemas.openxmlformats.org/wordprocessingml/2006/main" xmlns:wne="http://schemas.microsoft.com/office/word/2006/wordml" xmlns:wp14="http://schemas.microsoft.com/office/word/2010/wordprocessingDrawing" xmlns:wp="http://schemas.openxmlformats.org/drawingml/2006/wordprocessingDrawing" xmlns:wpc="http://schemas.microsoft.com/office/word/2010/wordprocessingCanvas" xmlns:wpg="http://schemas.microsoft.com/office/word/2010/wordprocessingGroup" xmlns:wpi="http://schemas.microsoft.com/office/word/2010/wordprocessingInk" xmlns:wps="http://schemas.microsoft.com/office/word/2010/wordprocessingShape" mc:Ignorable="w14 wp14">
+  <w:p>
+    <w:pPr>
+      <w:pStyle w:val="Footer"/>
+    </w:pPr>
+  </w:p>
+</w:ftr>
+</file>
+
+<file path=word/footer2.xml><?xml version="1.0" encoding="utf-8"?>
+<w:ftr xmlns:m="http://schemas.openxmlformats.org/officeDocument/2006/math" xmlns:mc="http://schemas.openxmlformats.org/markup-compatibility/2006" xmlns:mo="http://schemas.microsoft.com/office/mac/office/2008/main" xmlns:mv="urn:schemas-microsoft-com:mac:vml" xmlns:o="urn:schemas-microsoft-com:office:office" xmlns:r="http://schemas.openxmlformats.org/officeDocument/2006/relationships" xmlns:v="urn:schemas-microsoft-com:vml" xmlns:w10="urn:schemas-microsoft-com:office:word" xmlns:w14="http://schemas.microsoft.com/office/word/2010/wordml" xmlns:w="http://schemas.openxmlformats.org/wordprocessingml/2006/main" xmlns:wne="http://schemas.microsoft.com/office/word/2006/wordml" xmlns:wp14="http://schemas.microsoft.com/office/word/2010/wordprocessingDrawing" xmlns:wp="http://schemas.openxmlformats.org/drawingml/2006/wordprocessingDrawing" xmlns:wpc="http://schemas.microsoft.com/office/word/2010/wordprocessingCanvas" xmlns:wpg="http://schemas.microsoft.com/office/word/2010/wordprocessingGroup" xmlns:wpi="http://schemas.microsoft.com/office/word/2010/wordprocessingInk" xmlns:wps="http://schemas.microsoft.com/office/word/2010/wordprocessingShape" mc:Ignorable="w14 wp14">
+  <w:p>
+    <w:pPr>
+      <w:pStyle w:val="Footer"/>
+    </w:pPr>
+  </w:p>
+</w:ftr>
+</file>
+
+<file path=word/header1.xml><?xml version="1.0" encoding="utf-8"?>
+<w:hdr xmlns:m="http://schemas.openxmlformats.org/officeDocument/2006/math" xmlns:mc="http://schemas.openxmlformats.org/markup-compatibility/2006" xmlns:mo="http://schemas.microsoft.com/office/mac/office/2008/main" xmlns:mv="urn:schemas-microsoft-com:mac:vml" xmlns:o="urn:schemas-microsoft-com:office:office" xmlns:r="http://schemas.openxmlformats.org/officeDocument/2006/relationships" xmlns:v="urn:schemas-microsoft-com:vml" xmlns:w10="urn:schemas-microsoft-com:office:word" xmlns:w14="http://schemas.microsoft.com/office/word/2010/wordml" xmlns:w="http://schemas.openxmlformats.org/wordprocessingml/2006/main" xmlns:wne="http://schemas.microsoft.com/office/word/2006/wordml" xmlns:wp14="http://schemas.microsoft.com/office/word/2010/wordprocessingDrawing" xmlns:wp="http://schemas.openxmlformats.org/drawingml/2006/wordprocessingDrawing" xmlns:wpc="http://schemas.microsoft.com/office/word/2010/wordprocessingCanvas" xmlns:wpg="http://schemas.microsoft.com/office/word/2010/wordprocessingGroup" xmlns:wpi="http://schemas.microsoft.com/office/word/2010/wordprocessingInk" xmlns:wps="http://schemas.microsoft.com/office/word/2010/wordprocessingShape" mc:Ignorable="w14 wp14">
+  <w:p>
+    <w:pPr>
+      <w:pStyle w:val="Header"/>
+    </w:pPr>
+  </w:p>
+</w:hdr>
+</file>
+
+<file path=word/header2.xml><?xml version="1.0" encoding="utf-8"?>
+<w:hdr xmlns:m="http://schemas.openxmlformats.org/officeDocument/2006/math" xmlns:mc="http://schemas.openxmlformats.org/markup-compatibility/2006" xmlns:mo="http://schemas.microsoft.com/office/mac/office/2008/main" xmlns:mv="urn:schemas-microsoft-com:mac:vml" xmlns:o="urn:schemas-microsoft-com:office:office" xmlns:r="http://schemas.openxmlformats.org/officeDocument/2006/relationships" xmlns:v="urn:schemas-microsoft-com:vml" xmlns:w10="urn:schemas-microsoft-com:office:word" xmlns:w14="http://schemas.microsoft.com/office/word/2010/wordml" xmlns:w="http://schemas.openxmlformats.org/wordprocessingml/2006/main" xmlns:wne="http://schemas.microsoft.com/office/word/2006/wordml" xmlns:wp14="http://schemas.microsoft.com/office/word/2010/wordprocessingDrawing" xmlns:wp="http://schemas.openxmlformats.org/drawingml/2006/wordprocessingDrawing" xmlns:wpc="http://schemas.microsoft.com/office/word/2010/wordprocessingCanvas" xmlns:wpg="http://schemas.microsoft.com/office/word/2010/wordprocessingGroup" xmlns:wpi="http://schemas.microsoft.com/office/word/2010/wordprocessingInk" xmlns:wps="http://schemas.microsoft.com/office/word/2010/wordprocessingShape" mc:Ignorable="w14 wp14">
+  <w:p>
+    <w:pPr>
+      <w:pStyle w:val="Header"/>
+    </w:pPr>
+  </w:p>
+</w:hdr>
 </file>
 
 <file path=word/numbering.xml><?xml version="1.0" encoding="utf-8"?>

</xml_diff>